<commit_message>
Update SmartVision AI Teachable Machine
</commit_message>
<xml_diff>
--- a/LaporanPbProjek.docx
+++ b/LaporanPbProjek.docx
@@ -16,6 +16,14 @@
           <w:b/>
           <w:bCs/>
         </w:rPr>
+        <w:t xml:space="preserve">1. </w:t>
+      </w:r>
+      <w:r>
+        <w:rPr>
+          <w:rFonts w:ascii="Arial" w:hAnsi="Arial" w:cs="Arial"/>
+          <w:b/>
+          <w:bCs/>
+        </w:rPr>
         <w:t>Pengenalan Projek</w:t>
       </w:r>
     </w:p>
@@ -76,6 +84,14 @@
           <w:bCs/>
         </w:rPr>
       </w:pPr>
+      <w:r>
+        <w:rPr>
+          <w:rFonts w:ascii="Arial" w:hAnsi="Arial" w:cs="Arial"/>
+          <w:b/>
+          <w:bCs/>
+        </w:rPr>
+        <w:t xml:space="preserve">2. </w:t>
+      </w:r>
       <w:r>
         <w:rPr>
           <w:rFonts w:ascii="Arial" w:hAnsi="Arial" w:cs="Arial"/>
@@ -1558,6 +1574,638 @@
     </w:p>
     <w:p>
       <w:pPr>
+        <w:jc w:val="both"/>
+        <w:rPr>
+          <w:rFonts w:ascii="Arial" w:hAnsi="Arial" w:cs="Arial"/>
+        </w:rPr>
+      </w:pPr>
+    </w:p>
+    <w:p>
+      <w:pPr>
+        <w:jc w:val="both"/>
+        <w:rPr>
+          <w:rFonts w:ascii="Arial" w:hAnsi="Arial" w:cs="Arial"/>
+        </w:rPr>
+      </w:pPr>
+    </w:p>
+    <w:p>
+      <w:pPr>
+        <w:jc w:val="both"/>
+        <w:rPr>
+          <w:rFonts w:ascii="Arial" w:hAnsi="Arial" w:cs="Arial"/>
+          <w:b/>
+          <w:bCs/>
+        </w:rPr>
+      </w:pPr>
+      <w:r>
+        <w:rPr>
+          <w:rFonts w:ascii="Arial" w:hAnsi="Arial" w:cs="Arial"/>
+          <w:b/>
+          <w:bCs/>
+        </w:rPr>
+        <w:lastRenderedPageBreak/>
+        <w:t>LAMPIRAN</w:t>
+      </w:r>
+    </w:p>
+    <w:p>
+      <w:pPr>
+        <w:rPr>
+          <w:rFonts w:ascii="Arial" w:hAnsi="Arial" w:cs="Arial"/>
+          <w:b/>
+          <w:bCs/>
+        </w:rPr>
+      </w:pPr>
+    </w:p>
+    <w:p>
+      <w:pPr>
+        <w:pStyle w:val="ListParagraph"/>
+        <w:numPr>
+          <w:ilvl w:val="0"/>
+          <w:numId w:val="4"/>
+        </w:numPr>
+        <w:rPr>
+          <w:rFonts w:ascii="Arial" w:hAnsi="Arial" w:cs="Arial"/>
+          <w:b/>
+          <w:bCs/>
+        </w:rPr>
+      </w:pPr>
+      <w:r>
+        <w:rPr>
+          <w:rFonts w:ascii="Arial" w:hAnsi="Arial" w:cs="Arial"/>
+          <w:b/>
+          <w:bCs/>
+        </w:rPr>
+        <w:t xml:space="preserve">Link Website : </w:t>
+      </w:r>
+      <w:r>
+        <w:rPr>
+          <w:rFonts w:ascii="Arial" w:hAnsi="Arial" w:cs="Arial"/>
+          <w:b/>
+          <w:bCs/>
+          <w:u w:val="single"/>
+        </w:rPr>
+        <w:t>smart-vision-rho.vercel.app</w:t>
+      </w:r>
+    </w:p>
+    <w:p>
+      <w:pPr>
+        <w:pStyle w:val="ListParagraph"/>
+        <w:numPr>
+          <w:ilvl w:val="0"/>
+          <w:numId w:val="4"/>
+        </w:numPr>
+        <w:rPr>
+          <w:rFonts w:ascii="Arial" w:hAnsi="Arial" w:cs="Arial"/>
+          <w:b/>
+          <w:bCs/>
+        </w:rPr>
+      </w:pPr>
+      <w:r>
+        <w:rPr>
+          <w:rFonts w:ascii="Arial" w:hAnsi="Arial" w:cs="Arial"/>
+          <w:b/>
+          <w:bCs/>
+        </w:rPr>
+        <w:t>Interface :</w:t>
+      </w:r>
+      <w:r>
+        <w:rPr>
+          <w:noProof/>
+        </w:rPr>
+        <w:t xml:space="preserve"> </w:t>
+      </w:r>
+      <w:r>
+        <w:rPr>
+          <w:rFonts w:ascii="Arial" w:hAnsi="Arial" w:cs="Arial"/>
+          <w:b/>
+          <w:bCs/>
+        </w:rPr>
+        <w:drawing>
+          <wp:inline distT="0" distB="0" distL="0" distR="0" wp14:anchorId="022A95A9" wp14:editId="13F05C73">
+            <wp:extent cx="5731510" cy="2983230"/>
+            <wp:effectExtent l="0" t="0" r="2540" b="7620"/>
+            <wp:docPr id="491389385" name="Picture 1"/>
+            <wp:cNvGraphicFramePr>
+              <a:graphicFrameLocks xmlns:a="http://schemas.openxmlformats.org/drawingml/2006/main" noChangeAspect="1"/>
+            </wp:cNvGraphicFramePr>
+            <a:graphic xmlns:a="http://schemas.openxmlformats.org/drawingml/2006/main">
+              <a:graphicData uri="http://schemas.openxmlformats.org/drawingml/2006/picture">
+                <pic:pic xmlns:pic="http://schemas.openxmlformats.org/drawingml/2006/picture">
+                  <pic:nvPicPr>
+                    <pic:cNvPr id="491389385" name=""/>
+                    <pic:cNvPicPr/>
+                  </pic:nvPicPr>
+                  <pic:blipFill>
+                    <a:blip r:embed="rId5"/>
+                    <a:stretch>
+                      <a:fillRect/>
+                    </a:stretch>
+                  </pic:blipFill>
+                  <pic:spPr>
+                    <a:xfrm>
+                      <a:off x="0" y="0"/>
+                      <a:ext cx="5731510" cy="2983230"/>
+                    </a:xfrm>
+                    <a:prstGeom prst="rect">
+                      <a:avLst/>
+                    </a:prstGeom>
+                  </pic:spPr>
+                </pic:pic>
+              </a:graphicData>
+            </a:graphic>
+          </wp:inline>
+        </w:drawing>
+      </w:r>
+    </w:p>
+    <w:p>
+      <w:pPr>
+        <w:pStyle w:val="ListParagraph"/>
+        <w:numPr>
+          <w:ilvl w:val="0"/>
+          <w:numId w:val="4"/>
+        </w:numPr>
+        <w:rPr>
+          <w:rFonts w:ascii="Arial" w:hAnsi="Arial" w:cs="Arial"/>
+          <w:b/>
+          <w:bCs/>
+        </w:rPr>
+      </w:pPr>
+      <w:r>
+        <w:rPr>
+          <w:rFonts w:ascii="Arial" w:hAnsi="Arial" w:cs="Arial"/>
+          <w:b/>
+          <w:bCs/>
+        </w:rPr>
+        <w:t>PROMPT CHAT.GPT</w:t>
+      </w:r>
+    </w:p>
+    <w:p>
+      <w:r>
+        <w:rPr>
+          <w:rStyle w:val="min-w-0"/>
+        </w:rPr>
+        <w:t>Prompt 1 — Website Asas</w:t>
+      </w:r>
+    </w:p>
+    <w:p>
+      <w:pPr>
+        <w:pStyle w:val="NormalWeb"/>
+      </w:pPr>
+      <w:r>
+        <w:t>Saya perlu membina sebuah website untuk projek SmartVision AI. Website ini merupakan sistem Computer Vision yang menggunakan Google Teachable Machine untuk mengenal pasti objek. Buatkan website menggunakan HTML, CSS dan JavaScript yang mudah dan sesuai untuk projek kolej.</w:t>
+      </w:r>
+    </w:p>
+    <w:p>
+      <w:r>
+        <w:rPr>
+          <w:rStyle w:val="min-w-0"/>
+        </w:rPr>
+        <w:t>Prompt 2 — Design Website</w:t>
+      </w:r>
+    </w:p>
+    <w:p>
+      <w:pPr>
+        <w:pStyle w:val="NormalWeb"/>
+      </w:pPr>
+      <w:r>
+        <w:t>Saya nak website SmartVision AI yang lebih style dan moden tetapi tidak terlalu complicated. Gunakan design yang nampak seperti sistem AI atau Computer Vision. Website perlu mempunyai bahagian kamera, AI prediction, confidence dan senarai kelas objek.</w:t>
+      </w:r>
+    </w:p>
+    <w:p>
+      <w:r>
+        <w:rPr>
+          <w:rStyle w:val="min-w-0"/>
+        </w:rPr>
+        <w:t>Prompt 3 — Kelas Objek</w:t>
+      </w:r>
+    </w:p>
+    <w:p>
+      <w:pPr>
+        <w:pStyle w:val="NormalWeb"/>
+      </w:pPr>
+      <w:r>
+        <w:t>Saya mempunyai 5 kelas objek untuk model Teachable Machine iaitu Kereta Mainan, Stapler, Telefon, Laptop dan Dompet. Boleh masukkan kelima-lima kelas ini dalam website dan paparkan dalam bahagian AI Prediction?</w:t>
+      </w:r>
+    </w:p>
+    <w:p>
+      <w:pPr>
+        <w:rPr>
+          <w:rStyle w:val="min-w-0"/>
+        </w:rPr>
+      </w:pPr>
+      <w:r>
+        <w:rPr>
+          <w:rStyle w:val="min-w-0"/>
+        </w:rPr>
+        <w:br w:type="page"/>
+      </w:r>
+    </w:p>
+    <w:p>
+      <w:r>
+        <w:rPr>
+          <w:rStyle w:val="min-w-0"/>
+        </w:rPr>
+        <w:lastRenderedPageBreak/>
+        <w:t>Prompt 4 — Integrasi Model</w:t>
+      </w:r>
+    </w:p>
+    <w:p>
+      <w:pPr>
+        <w:pStyle w:val="NormalWeb"/>
+      </w:pPr>
+      <w:r>
+        <w:t>Ini ialah JavaScript yang diberikan oleh kawan saya daripada Teachable Machine. Gabungkan JavaScript ini dengan website SmartVision AI supaya webcam boleh digunakan untuk membuat prediction dan memaparkan nama objek serta confidence.</w:t>
+      </w:r>
+    </w:p>
+    <w:p>
+      <w:r>
+        <w:rPr>
+          <w:rStyle w:val="min-w-0"/>
+        </w:rPr>
+        <w:t>Prompt 5 — Gabungkan HTML CSS JS</w:t>
+      </w:r>
+    </w:p>
+    <w:p>
+      <w:pPr>
+        <w:pStyle w:val="NormalWeb"/>
+      </w:pPr>
+      <w:r>
+        <w:t>Saya sudah mempunyai index.html dan style.css untuk website SmartVision AI. Gunakan design dan coding yang saya berikan tanpa membuat website baru. Gabungkan JavaScript Teachable Machine ke dalam coding sedia ada supaya kamera dan prediction boleh berfungsi.</w:t>
+      </w:r>
+    </w:p>
+    <w:p>
+      <w:r>
+        <w:rPr>
+          <w:rStyle w:val="min-w-0"/>
+        </w:rPr>
+        <w:t>Prompt 6 — Confidence</w:t>
+      </w:r>
+    </w:p>
+    <w:p>
+      <w:pPr>
+        <w:pStyle w:val="NormalWeb"/>
+      </w:pPr>
+      <w:r>
+        <w:t>Saya mahu website memaparkan nama objek yang paling tinggi prediction dan nilai confidence dalam bentuk peratus. Jika confidence terlalu rendah, paparkan "Objek Tidak Dikenali".</w:t>
+      </w:r>
+    </w:p>
+    <w:p>
+      <w:r>
+        <w:rPr>
+          <w:rStyle w:val="min-w-0"/>
+        </w:rPr>
+        <w:t>Prompt 7 — Kelas Model Baru</w:t>
+      </w:r>
+    </w:p>
+    <w:p>
+      <w:pPr>
+        <w:pStyle w:val="NormalWeb"/>
+      </w:pPr>
+      <w:r>
+        <w:t>Model Teachable Machine saya telah ditukar kepada 5 kelas baru iaitu Perfume, Kereta Mainan, Medal, Kad dan Duit. Tukarkan senarai kelas dalam website supaya sama dengan model baru.</w:t>
+      </w:r>
+    </w:p>
+    <w:p>
+      <w:r>
+        <w:rPr>
+          <w:rStyle w:val="min-w-0"/>
+        </w:rPr>
+        <w:t>Prompt 8 — Folder Model</w:t>
+      </w:r>
+    </w:p>
+    <w:p>
+      <w:pPr>
+        <w:pStyle w:val="NormalWeb"/>
+      </w:pPr>
+      <w:r>
+        <w:t>Saya tidak mempunyai folder my_model. Apakah fail yang perlu ada dalam folder my_model supaya model Teachable Machine TensorFlow.js boleh digunakan dalam website?</w:t>
+      </w:r>
+    </w:p>
+    <w:p>
+      <w:r>
+        <w:rPr>
+          <w:rStyle w:val="min-w-0"/>
+        </w:rPr>
+        <w:t>Prompt 9 — Baiki CORS</w:t>
+      </w:r>
+    </w:p>
+    <w:p>
+      <w:pPr>
+        <w:pStyle w:val="NormalWeb"/>
+      </w:pPr>
+      <w:r>
+        <w:t>Website saya mengalami error CORS apabila saya membuka index.html secara terus menggunakan file:///. Error menunjukkan model.json tidak boleh dimuatkan. Apakah cara paling mudah untuk menjalankan website supaya model Teachable Machine boleh dimuatkan?</w:t>
+      </w:r>
+    </w:p>
+    <w:p>
+      <w:pPr>
+        <w:rPr>
+          <w:rStyle w:val="min-w-0"/>
+        </w:rPr>
+      </w:pPr>
+    </w:p>
+    <w:p>
+      <w:r>
+        <w:rPr>
+          <w:rStyle w:val="min-w-0"/>
+        </w:rPr>
+        <w:t>Prompt 10 — Jumlah Dataset</w:t>
+      </w:r>
+    </w:p>
+    <w:p>
+      <w:pPr>
+        <w:pStyle w:val="NormalWeb"/>
+      </w:pPr>
+      <w:r>
+        <w:t>Saya menggunakan Google Teachable Machine untuk melatih model SmartVision AI. Bagaimana saya boleh melihat jumlah gambar yang digunakan untuk setiap kelas?</w:t>
+      </w:r>
+    </w:p>
+    <w:p>
+      <w:pPr>
+        <w:rPr>
+          <w:rStyle w:val="min-w-0"/>
+        </w:rPr>
+      </w:pPr>
+      <w:r>
+        <w:rPr>
+          <w:rStyle w:val="min-w-0"/>
+        </w:rPr>
+        <w:br w:type="page"/>
+      </w:r>
+    </w:p>
+    <w:p>
+      <w:r>
+        <w:rPr>
+          <w:rStyle w:val="min-w-0"/>
+        </w:rPr>
+        <w:lastRenderedPageBreak/>
+        <w:t>Prompt 11 — README</w:t>
+      </w:r>
+    </w:p>
+    <w:p>
+      <w:pPr>
+        <w:pStyle w:val="NormalWeb"/>
+      </w:pPr>
+      <w:r>
+        <w:t>Buatkan README.md lengkap untuk assignment SmartVision AI saya. Projek menggunakan Google Teachable Machine, TensorFlow.js, HTML, CSS dan JavaScript. Model mempunyai 5 kelas iaitu Perfume, Kereta Mainan, Medal, Kad dan Duit. Masukkan pengenalan, objektif, teknologi, kelas objek, metodologi, cara sistem berfungsi, struktur fail, cara menjalankan sistem, pengujian, eksperimen, AI Code Assistant, limitasi, penambahbaikan dan kesimpulan.</w:t>
+      </w:r>
+    </w:p>
+    <w:p>
+      <w:r>
+        <w:rPr>
+          <w:rStyle w:val="min-w-0"/>
+        </w:rPr>
+        <w:t>Prompt 12 — Dokumentasi AI Code Assistant</w:t>
+      </w:r>
+    </w:p>
+    <w:p>
+      <w:pPr>
+        <w:pStyle w:val="NormalWeb"/>
+      </w:pPr>
+      <w:r>
+        <w:t>Saya perlu dokumentasikan penggunaan AI Code Assistant untuk assignment SmartVision AI. Berikan prompt yang sesuai berdasarkan proses pembangunan website saya, termasuk membina HTML, CSS, mengintegrasikan Teachable Machine, membuat prediction, confidence, membaiki error dan menyediakan README.</w:t>
+      </w:r>
+    </w:p>
+    <w:p>
+      <w:pPr>
+        <w:pStyle w:val="ListParagraph"/>
+        <w:numPr>
+          <w:ilvl w:val="0"/>
+          <w:numId w:val="4"/>
+        </w:numPr>
+        <w:rPr>
+          <w:rFonts w:ascii="Arial" w:hAnsi="Arial" w:cs="Arial"/>
+          <w:b/>
+          <w:bCs/>
+        </w:rPr>
+      </w:pPr>
+      <w:r>
+        <w:rPr>
+          <w:rFonts w:ascii="Arial" w:hAnsi="Arial" w:cs="Arial"/>
+          <w:b/>
+          <w:bCs/>
+        </w:rPr>
+        <w:t>Jumlah Image : 3971</w:t>
+      </w:r>
+    </w:p>
+    <w:p>
+      <w:pPr>
+        <w:pStyle w:val="ListParagraph"/>
+        <w:numPr>
+          <w:ilvl w:val="0"/>
+          <w:numId w:val="5"/>
+        </w:numPr>
+        <w:spacing w:after="0" w:line="240" w:lineRule="auto"/>
+        <w:rPr>
+          <w:rFonts w:ascii="Arial" w:eastAsia="Times New Roman" w:hAnsi="Arial" w:cs="Arial"/>
+          <w:kern w:val="0"/>
+          <w:lang w:eastAsia="en-MY"/>
+          <w14:ligatures w14:val="none"/>
+        </w:rPr>
+      </w:pPr>
+      <w:r>
+        <w:rPr>
+          <w:rFonts w:ascii="Arial" w:eastAsia="Times New Roman" w:hAnsi="Arial" w:cs="Arial"/>
+          <w:kern w:val="0"/>
+          <w:lang w:eastAsia="en-MY"/>
+          <w14:ligatures w14:val="none"/>
+        </w:rPr>
+        <w:t xml:space="preserve">Class 1: </w:t>
+      </w:r>
+      <w:r>
+        <w:rPr>
+          <w:rFonts w:ascii="Arial" w:eastAsia="Times New Roman" w:hAnsi="Arial" w:cs="Arial"/>
+          <w:b/>
+          <w:bCs/>
+          <w:kern w:val="0"/>
+          <w:lang w:eastAsia="en-MY"/>
+          <w14:ligatures w14:val="none"/>
+        </w:rPr>
+        <w:t>795</w:t>
+      </w:r>
+      <w:r>
+        <w:rPr>
+          <w:rFonts w:ascii="Arial" w:eastAsia="Times New Roman" w:hAnsi="Arial" w:cs="Arial"/>
+          <w:kern w:val="0"/>
+          <w:lang w:eastAsia="en-MY"/>
+          <w14:ligatures w14:val="none"/>
+        </w:rPr>
+        <w:t xml:space="preserve"> </w:t>
+      </w:r>
+    </w:p>
+    <w:p>
+      <w:pPr>
+        <w:pStyle w:val="ListParagraph"/>
+        <w:numPr>
+          <w:ilvl w:val="0"/>
+          <w:numId w:val="5"/>
+        </w:numPr>
+        <w:spacing w:after="0" w:line="240" w:lineRule="auto"/>
+        <w:rPr>
+          <w:rFonts w:ascii="Arial" w:eastAsia="Times New Roman" w:hAnsi="Arial" w:cs="Arial"/>
+          <w:kern w:val="0"/>
+          <w:lang w:eastAsia="en-MY"/>
+          <w14:ligatures w14:val="none"/>
+        </w:rPr>
+      </w:pPr>
+      <w:r>
+        <w:rPr>
+          <w:rFonts w:ascii="Arial" w:eastAsia="Times New Roman" w:hAnsi="Arial" w:cs="Arial"/>
+          <w:kern w:val="0"/>
+          <w:lang w:eastAsia="en-MY"/>
+          <w14:ligatures w14:val="none"/>
+        </w:rPr>
+        <w:t xml:space="preserve">Class 2: </w:t>
+      </w:r>
+      <w:r>
+        <w:rPr>
+          <w:rFonts w:ascii="Arial" w:eastAsia="Times New Roman" w:hAnsi="Arial" w:cs="Arial"/>
+          <w:b/>
+          <w:bCs/>
+          <w:kern w:val="0"/>
+          <w:lang w:eastAsia="en-MY"/>
+          <w14:ligatures w14:val="none"/>
+        </w:rPr>
+        <w:t>794</w:t>
+      </w:r>
+      <w:r>
+        <w:rPr>
+          <w:rFonts w:ascii="Arial" w:eastAsia="Times New Roman" w:hAnsi="Arial" w:cs="Arial"/>
+          <w:kern w:val="0"/>
+          <w:lang w:eastAsia="en-MY"/>
+          <w14:ligatures w14:val="none"/>
+        </w:rPr>
+        <w:t xml:space="preserve"> </w:t>
+      </w:r>
+    </w:p>
+    <w:p>
+      <w:pPr>
+        <w:pStyle w:val="ListParagraph"/>
+        <w:numPr>
+          <w:ilvl w:val="0"/>
+          <w:numId w:val="5"/>
+        </w:numPr>
+        <w:spacing w:after="0" w:line="240" w:lineRule="auto"/>
+        <w:rPr>
+          <w:rFonts w:ascii="Arial" w:eastAsia="Times New Roman" w:hAnsi="Arial" w:cs="Arial"/>
+          <w:kern w:val="0"/>
+          <w:lang w:eastAsia="en-MY"/>
+          <w14:ligatures w14:val="none"/>
+        </w:rPr>
+      </w:pPr>
+      <w:r>
+        <w:rPr>
+          <w:rFonts w:ascii="Arial" w:eastAsia="Times New Roman" w:hAnsi="Arial" w:cs="Arial"/>
+          <w:kern w:val="0"/>
+          <w:lang w:eastAsia="en-MY"/>
+          <w14:ligatures w14:val="none"/>
+        </w:rPr>
+        <w:t xml:space="preserve">Class 3: </w:t>
+      </w:r>
+      <w:r>
+        <w:rPr>
+          <w:rFonts w:ascii="Arial" w:eastAsia="Times New Roman" w:hAnsi="Arial" w:cs="Arial"/>
+          <w:b/>
+          <w:bCs/>
+          <w:kern w:val="0"/>
+          <w:lang w:eastAsia="en-MY"/>
+          <w14:ligatures w14:val="none"/>
+        </w:rPr>
+        <w:t>793</w:t>
+      </w:r>
+      <w:r>
+        <w:rPr>
+          <w:rFonts w:ascii="Arial" w:eastAsia="Times New Roman" w:hAnsi="Arial" w:cs="Arial"/>
+          <w:kern w:val="0"/>
+          <w:lang w:eastAsia="en-MY"/>
+          <w14:ligatures w14:val="none"/>
+        </w:rPr>
+        <w:t xml:space="preserve"> </w:t>
+      </w:r>
+    </w:p>
+    <w:p>
+      <w:pPr>
+        <w:pStyle w:val="ListParagraph"/>
+        <w:numPr>
+          <w:ilvl w:val="0"/>
+          <w:numId w:val="5"/>
+        </w:numPr>
+        <w:spacing w:after="0" w:line="240" w:lineRule="auto"/>
+        <w:rPr>
+          <w:rFonts w:ascii="Arial" w:eastAsia="Times New Roman" w:hAnsi="Arial" w:cs="Arial"/>
+          <w:kern w:val="0"/>
+          <w:lang w:eastAsia="en-MY"/>
+          <w14:ligatures w14:val="none"/>
+        </w:rPr>
+      </w:pPr>
+      <w:r>
+        <w:rPr>
+          <w:rFonts w:ascii="Arial" w:eastAsia="Times New Roman" w:hAnsi="Arial" w:cs="Arial"/>
+          <w:kern w:val="0"/>
+          <w:lang w:eastAsia="en-MY"/>
+          <w14:ligatures w14:val="none"/>
+        </w:rPr>
+        <w:t xml:space="preserve">Class 4: </w:t>
+      </w:r>
+      <w:r>
+        <w:rPr>
+          <w:rFonts w:ascii="Arial" w:eastAsia="Times New Roman" w:hAnsi="Arial" w:cs="Arial"/>
+          <w:b/>
+          <w:bCs/>
+          <w:kern w:val="0"/>
+          <w:lang w:eastAsia="en-MY"/>
+          <w14:ligatures w14:val="none"/>
+        </w:rPr>
+        <w:t>795</w:t>
+      </w:r>
+      <w:r>
+        <w:rPr>
+          <w:rFonts w:ascii="Arial" w:eastAsia="Times New Roman" w:hAnsi="Arial" w:cs="Arial"/>
+          <w:kern w:val="0"/>
+          <w:lang w:eastAsia="en-MY"/>
+          <w14:ligatures w14:val="none"/>
+        </w:rPr>
+        <w:t xml:space="preserve"> </w:t>
+      </w:r>
+    </w:p>
+    <w:p>
+      <w:pPr>
+        <w:pStyle w:val="ListParagraph"/>
+        <w:numPr>
+          <w:ilvl w:val="0"/>
+          <w:numId w:val="5"/>
+        </w:numPr>
+        <w:spacing w:after="0" w:line="240" w:lineRule="auto"/>
+        <w:rPr>
+          <w:rFonts w:ascii="Arial" w:eastAsia="Times New Roman" w:hAnsi="Arial" w:cs="Arial"/>
+          <w:kern w:val="0"/>
+          <w:lang w:eastAsia="en-MY"/>
+          <w14:ligatures w14:val="none"/>
+        </w:rPr>
+      </w:pPr>
+      <w:r>
+        <w:rPr>
+          <w:rFonts w:ascii="Arial" w:eastAsia="Times New Roman" w:hAnsi="Arial" w:cs="Arial"/>
+          <w:kern w:val="0"/>
+          <w:lang w:eastAsia="en-MY"/>
+          <w14:ligatures w14:val="none"/>
+        </w:rPr>
+        <w:t xml:space="preserve">Class 5: </w:t>
+      </w:r>
+      <w:r>
+        <w:rPr>
+          <w:rFonts w:ascii="Arial" w:eastAsia="Times New Roman" w:hAnsi="Arial" w:cs="Arial"/>
+          <w:b/>
+          <w:bCs/>
+          <w:kern w:val="0"/>
+          <w:lang w:eastAsia="en-MY"/>
+          <w14:ligatures w14:val="none"/>
+        </w:rPr>
+        <w:t>794</w:t>
+      </w:r>
+    </w:p>
+    <w:p>
+      <w:pPr>
         <w:rPr>
           <w:rFonts w:ascii="Arial" w:hAnsi="Arial" w:cs="Arial"/>
         </w:rPr>
@@ -1696,6 +2344,92 @@
     </w:lvl>
   </w:abstractNum>
   <w:abstractNum w:abstractNumId="1" w15:restartNumberingAfterBreak="0">
+    <w:nsid w:val="1F942128"/>
+    <w:multiLevelType w:val="hybridMultilevel"/>
+    <w:tmpl w:val="8C8E91A6"/>
+    <w:lvl w:ilvl="0" w:tplc="4409000F">
+      <w:start w:val="1"/>
+      <w:numFmt w:val="decimal"/>
+      <w:lvlText w:val="%1."/>
+      <w:lvlJc w:val="left"/>
+      <w:pPr>
+        <w:ind w:left="720" w:hanging="360"/>
+      </w:pPr>
+    </w:lvl>
+    <w:lvl w:ilvl="1" w:tplc="44090019" w:tentative="1">
+      <w:start w:val="1"/>
+      <w:numFmt w:val="lowerLetter"/>
+      <w:lvlText w:val="%2."/>
+      <w:lvlJc w:val="left"/>
+      <w:pPr>
+        <w:ind w:left="1440" w:hanging="360"/>
+      </w:pPr>
+    </w:lvl>
+    <w:lvl w:ilvl="2" w:tplc="4409001B" w:tentative="1">
+      <w:start w:val="1"/>
+      <w:numFmt w:val="lowerRoman"/>
+      <w:lvlText w:val="%3."/>
+      <w:lvlJc w:val="right"/>
+      <w:pPr>
+        <w:ind w:left="2160" w:hanging="180"/>
+      </w:pPr>
+    </w:lvl>
+    <w:lvl w:ilvl="3" w:tplc="4409000F" w:tentative="1">
+      <w:start w:val="1"/>
+      <w:numFmt w:val="decimal"/>
+      <w:lvlText w:val="%4."/>
+      <w:lvlJc w:val="left"/>
+      <w:pPr>
+        <w:ind w:left="2880" w:hanging="360"/>
+      </w:pPr>
+    </w:lvl>
+    <w:lvl w:ilvl="4" w:tplc="44090019" w:tentative="1">
+      <w:start w:val="1"/>
+      <w:numFmt w:val="lowerLetter"/>
+      <w:lvlText w:val="%5."/>
+      <w:lvlJc w:val="left"/>
+      <w:pPr>
+        <w:ind w:left="3600" w:hanging="360"/>
+      </w:pPr>
+    </w:lvl>
+    <w:lvl w:ilvl="5" w:tplc="4409001B" w:tentative="1">
+      <w:start w:val="1"/>
+      <w:numFmt w:val="lowerRoman"/>
+      <w:lvlText w:val="%6."/>
+      <w:lvlJc w:val="right"/>
+      <w:pPr>
+        <w:ind w:left="4320" w:hanging="180"/>
+      </w:pPr>
+    </w:lvl>
+    <w:lvl w:ilvl="6" w:tplc="4409000F" w:tentative="1">
+      <w:start w:val="1"/>
+      <w:numFmt w:val="decimal"/>
+      <w:lvlText w:val="%7."/>
+      <w:lvlJc w:val="left"/>
+      <w:pPr>
+        <w:ind w:left="5040" w:hanging="360"/>
+      </w:pPr>
+    </w:lvl>
+    <w:lvl w:ilvl="7" w:tplc="44090019" w:tentative="1">
+      <w:start w:val="1"/>
+      <w:numFmt w:val="lowerLetter"/>
+      <w:lvlText w:val="%8."/>
+      <w:lvlJc w:val="left"/>
+      <w:pPr>
+        <w:ind w:left="5760" w:hanging="360"/>
+      </w:pPr>
+    </w:lvl>
+    <w:lvl w:ilvl="8" w:tplc="4409001B" w:tentative="1">
+      <w:start w:val="1"/>
+      <w:numFmt w:val="lowerRoman"/>
+      <w:lvlText w:val="%9."/>
+      <w:lvlJc w:val="right"/>
+      <w:pPr>
+        <w:ind w:left="6480" w:hanging="180"/>
+      </w:pPr>
+    </w:lvl>
+  </w:abstractNum>
+  <w:abstractNum w:abstractNumId="2" w15:restartNumberingAfterBreak="0">
     <w:nsid w:val="2D497E39"/>
     <w:multiLevelType w:val="multilevel"/>
     <w:tmpl w:val="5A30749A"/>
@@ -1844,7 +2578,7 @@
       </w:rPr>
     </w:lvl>
   </w:abstractNum>
-  <w:abstractNum w:abstractNumId="2" w15:restartNumberingAfterBreak="0">
+  <w:abstractNum w:abstractNumId="3" w15:restartNumberingAfterBreak="0">
     <w:nsid w:val="46D51CB1"/>
     <w:multiLevelType w:val="multilevel"/>
     <w:tmpl w:val="D1B6C2B6"/>
@@ -1993,14 +2727,133 @@
       </w:rPr>
     </w:lvl>
   </w:abstractNum>
+  <w:abstractNum w:abstractNumId="4" w15:restartNumberingAfterBreak="0">
+    <w:nsid w:val="502F596D"/>
+    <w:multiLevelType w:val="hybridMultilevel"/>
+    <w:tmpl w:val="02CC8A42"/>
+    <w:lvl w:ilvl="0" w:tplc="44090001">
+      <w:start w:val="1"/>
+      <w:numFmt w:val="bullet"/>
+      <w:lvlText w:val=""/>
+      <w:lvlJc w:val="left"/>
+      <w:pPr>
+        <w:ind w:left="1440" w:hanging="360"/>
+      </w:pPr>
+      <w:rPr>
+        <w:rFonts w:ascii="Symbol" w:hAnsi="Symbol" w:hint="default"/>
+      </w:rPr>
+    </w:lvl>
+    <w:lvl w:ilvl="1" w:tplc="44090003" w:tentative="1">
+      <w:start w:val="1"/>
+      <w:numFmt w:val="bullet"/>
+      <w:lvlText w:val="o"/>
+      <w:lvlJc w:val="left"/>
+      <w:pPr>
+        <w:ind w:left="2160" w:hanging="360"/>
+      </w:pPr>
+      <w:rPr>
+        <w:rFonts w:ascii="Courier New" w:hAnsi="Courier New" w:cs="Courier New" w:hint="default"/>
+      </w:rPr>
+    </w:lvl>
+    <w:lvl w:ilvl="2" w:tplc="44090005" w:tentative="1">
+      <w:start w:val="1"/>
+      <w:numFmt w:val="bullet"/>
+      <w:lvlText w:val=""/>
+      <w:lvlJc w:val="left"/>
+      <w:pPr>
+        <w:ind w:left="2880" w:hanging="360"/>
+      </w:pPr>
+      <w:rPr>
+        <w:rFonts w:ascii="Wingdings" w:hAnsi="Wingdings" w:hint="default"/>
+      </w:rPr>
+    </w:lvl>
+    <w:lvl w:ilvl="3" w:tplc="44090001" w:tentative="1">
+      <w:start w:val="1"/>
+      <w:numFmt w:val="bullet"/>
+      <w:lvlText w:val=""/>
+      <w:lvlJc w:val="left"/>
+      <w:pPr>
+        <w:ind w:left="3600" w:hanging="360"/>
+      </w:pPr>
+      <w:rPr>
+        <w:rFonts w:ascii="Symbol" w:hAnsi="Symbol" w:hint="default"/>
+      </w:rPr>
+    </w:lvl>
+    <w:lvl w:ilvl="4" w:tplc="44090003" w:tentative="1">
+      <w:start w:val="1"/>
+      <w:numFmt w:val="bullet"/>
+      <w:lvlText w:val="o"/>
+      <w:lvlJc w:val="left"/>
+      <w:pPr>
+        <w:ind w:left="4320" w:hanging="360"/>
+      </w:pPr>
+      <w:rPr>
+        <w:rFonts w:ascii="Courier New" w:hAnsi="Courier New" w:cs="Courier New" w:hint="default"/>
+      </w:rPr>
+    </w:lvl>
+    <w:lvl w:ilvl="5" w:tplc="44090005" w:tentative="1">
+      <w:start w:val="1"/>
+      <w:numFmt w:val="bullet"/>
+      <w:lvlText w:val=""/>
+      <w:lvlJc w:val="left"/>
+      <w:pPr>
+        <w:ind w:left="5040" w:hanging="360"/>
+      </w:pPr>
+      <w:rPr>
+        <w:rFonts w:ascii="Wingdings" w:hAnsi="Wingdings" w:hint="default"/>
+      </w:rPr>
+    </w:lvl>
+    <w:lvl w:ilvl="6" w:tplc="44090001" w:tentative="1">
+      <w:start w:val="1"/>
+      <w:numFmt w:val="bullet"/>
+      <w:lvlText w:val=""/>
+      <w:lvlJc w:val="left"/>
+      <w:pPr>
+        <w:ind w:left="5760" w:hanging="360"/>
+      </w:pPr>
+      <w:rPr>
+        <w:rFonts w:ascii="Symbol" w:hAnsi="Symbol" w:hint="default"/>
+      </w:rPr>
+    </w:lvl>
+    <w:lvl w:ilvl="7" w:tplc="44090003" w:tentative="1">
+      <w:start w:val="1"/>
+      <w:numFmt w:val="bullet"/>
+      <w:lvlText w:val="o"/>
+      <w:lvlJc w:val="left"/>
+      <w:pPr>
+        <w:ind w:left="6480" w:hanging="360"/>
+      </w:pPr>
+      <w:rPr>
+        <w:rFonts w:ascii="Courier New" w:hAnsi="Courier New" w:cs="Courier New" w:hint="default"/>
+      </w:rPr>
+    </w:lvl>
+    <w:lvl w:ilvl="8" w:tplc="44090005" w:tentative="1">
+      <w:start w:val="1"/>
+      <w:numFmt w:val="bullet"/>
+      <w:lvlText w:val=""/>
+      <w:lvlJc w:val="left"/>
+      <w:pPr>
+        <w:ind w:left="7200" w:hanging="360"/>
+      </w:pPr>
+      <w:rPr>
+        <w:rFonts w:ascii="Wingdings" w:hAnsi="Wingdings" w:hint="default"/>
+      </w:rPr>
+    </w:lvl>
+  </w:abstractNum>
   <w:num w:numId="1" w16cid:durableId="1448886093">
-    <w:abstractNumId w:val="1"/>
+    <w:abstractNumId w:val="2"/>
   </w:num>
   <w:num w:numId="2" w16cid:durableId="1157501096">
     <w:abstractNumId w:val="0"/>
   </w:num>
   <w:num w:numId="3" w16cid:durableId="958296653">
-    <w:abstractNumId w:val="2"/>
+    <w:abstractNumId w:val="3"/>
+  </w:num>
+  <w:num w:numId="4" w16cid:durableId="1826512569">
+    <w:abstractNumId w:val="1"/>
+  </w:num>
+  <w:num w:numId="5" w16cid:durableId="1608732495">
+    <w:abstractNumId w:val="4"/>
   </w:num>
 </w:numbering>
 </file>
@@ -2921,6 +3774,39 @@
       <w:spacing w:val="5"/>
     </w:rPr>
   </w:style>
+  <w:style w:type="character" w:customStyle="1" w:styleId="min-w-0">
+    <w:name w:val="min-w-0"/>
+    <w:basedOn w:val="DefaultParagraphFont"/>
+    <w:rsid w:val="00C76CD2"/>
+  </w:style>
+  <w:style w:type="paragraph" w:styleId="NormalWeb">
+    <w:name w:val="Normal (Web)"/>
+    <w:basedOn w:val="Normal"/>
+    <w:uiPriority w:val="99"/>
+    <w:semiHidden/>
+    <w:unhideWhenUsed/>
+    <w:rsid w:val="00C76CD2"/>
+    <w:pPr>
+      <w:spacing w:before="100" w:beforeAutospacing="1" w:after="100" w:afterAutospacing="1" w:line="240" w:lineRule="auto"/>
+    </w:pPr>
+    <w:rPr>
+      <w:rFonts w:ascii="Times New Roman" w:eastAsia="Times New Roman" w:hAnsi="Times New Roman" w:cs="Times New Roman"/>
+      <w:kern w:val="0"/>
+      <w:lang w:eastAsia="en-MY"/>
+      <w14:ligatures w14:val="none"/>
+    </w:rPr>
+  </w:style>
+  <w:style w:type="character" w:styleId="Strong">
+    <w:name w:val="Strong"/>
+    <w:basedOn w:val="DefaultParagraphFont"/>
+    <w:uiPriority w:val="22"/>
+    <w:qFormat/>
+    <w:rsid w:val="006A4D6A"/>
+    <w:rPr>
+      <w:b/>
+      <w:bCs/>
+    </w:rPr>
+  </w:style>
 </w:styles>
 </file>
 

</xml_diff>

<commit_message>
Update SmartVision AI Teachable Machine 2
</commit_message>
<xml_diff>
--- a/LaporanPbProjek.docx
+++ b/LaporanPbProjek.docx
@@ -2206,6 +2206,76 @@
     </w:p>
     <w:p>
       <w:pPr>
+        <w:pStyle w:val="ListParagraph"/>
+        <w:spacing w:after="0" w:line="240" w:lineRule="auto"/>
+        <w:ind w:left="1440"/>
+        <w:rPr>
+          <w:rFonts w:ascii="Arial" w:eastAsia="Times New Roman" w:hAnsi="Arial" w:cs="Arial"/>
+          <w:kern w:val="0"/>
+          <w:lang w:eastAsia="en-MY"/>
+          <w14:ligatures w14:val="none"/>
+        </w:rPr>
+      </w:pPr>
+    </w:p>
+    <w:p>
+      <w:pPr>
+        <w:pStyle w:val="ListParagraph"/>
+        <w:numPr>
+          <w:ilvl w:val="0"/>
+          <w:numId w:val="4"/>
+        </w:numPr>
+        <w:spacing w:after="0" w:line="240" w:lineRule="auto"/>
+        <w:rPr>
+          <w:rFonts w:ascii="Arial" w:eastAsia="Times New Roman" w:hAnsi="Arial" w:cs="Arial"/>
+          <w:b/>
+          <w:bCs/>
+          <w:kern w:val="0"/>
+          <w:lang w:eastAsia="en-MY"/>
+          <w14:ligatures w14:val="none"/>
+        </w:rPr>
+      </w:pPr>
+      <w:r>
+        <w:rPr>
+          <w:rFonts w:ascii="Arial" w:eastAsia="Times New Roman" w:hAnsi="Arial" w:cs="Arial"/>
+          <w:b/>
+          <w:bCs/>
+          <w:kern w:val="0"/>
+          <w:lang w:eastAsia="en-MY"/>
+          <w14:ligatures w14:val="none"/>
+        </w:rPr>
+        <w:t xml:space="preserve">GITHUB: </w:t>
+      </w:r>
+      <w:hyperlink r:id="rId6" w:history="1">
+        <w:r>
+          <w:rPr>
+            <w:rStyle w:val="Hyperlink"/>
+            <w:rFonts w:ascii="Arial" w:eastAsia="Times New Roman" w:hAnsi="Arial" w:cs="Arial"/>
+            <w:b/>
+            <w:bCs/>
+            <w:kern w:val="0"/>
+            <w:lang w:eastAsia="en-MY"/>
+            <w14:ligatures w14:val="none"/>
+          </w:rPr>
+          <w:t>https://github.com/nish070222/SmartVision</w:t>
+        </w:r>
+      </w:hyperlink>
+    </w:p>
+    <w:p>
+      <w:pPr>
+        <w:pStyle w:val="ListParagraph"/>
+        <w:spacing w:after="0" w:line="240" w:lineRule="auto"/>
+        <w:rPr>
+          <w:rFonts w:ascii="Arial" w:eastAsia="Times New Roman" w:hAnsi="Arial" w:cs="Arial"/>
+          <w:b/>
+          <w:bCs/>
+          <w:kern w:val="0"/>
+          <w:lang w:eastAsia="en-MY"/>
+          <w14:ligatures w14:val="none"/>
+        </w:rPr>
+      </w:pPr>
+    </w:p>
+    <w:p>
+      <w:pPr>
         <w:rPr>
           <w:rFonts w:ascii="Arial" w:hAnsi="Arial" w:cs="Arial"/>
         </w:rPr>
@@ -2346,7 +2416,7 @@
   <w:abstractNum w:abstractNumId="1" w15:restartNumberingAfterBreak="0">
     <w:nsid w:val="1F942128"/>
     <w:multiLevelType w:val="hybridMultilevel"/>
-    <w:tmpl w:val="8C8E91A6"/>
+    <w:tmpl w:val="A7CCA5B4"/>
     <w:lvl w:ilvl="0" w:tplc="4409000F">
       <w:start w:val="1"/>
       <w:numFmt w:val="decimal"/>
@@ -3807,6 +3877,29 @@
       <w:bCs/>
     </w:rPr>
   </w:style>
+  <w:style w:type="character" w:styleId="Hyperlink">
+    <w:name w:val="Hyperlink"/>
+    <w:basedOn w:val="DefaultParagraphFont"/>
+    <w:uiPriority w:val="99"/>
+    <w:unhideWhenUsed/>
+    <w:rsid w:val="005F2004"/>
+    <w:rPr>
+      <w:color w:val="467886" w:themeColor="hyperlink"/>
+      <w:u w:val="single"/>
+    </w:rPr>
+  </w:style>
+  <w:style w:type="character" w:styleId="UnresolvedMention">
+    <w:name w:val="Unresolved Mention"/>
+    <w:basedOn w:val="DefaultParagraphFont"/>
+    <w:uiPriority w:val="99"/>
+    <w:semiHidden/>
+    <w:unhideWhenUsed/>
+    <w:rsid w:val="005F2004"/>
+    <w:rPr>
+      <w:color w:val="605E5C"/>
+      <w:shd w:val="clear" w:color="auto" w:fill="E1DFDD"/>
+    </w:rPr>
+  </w:style>
 </w:styles>
 </file>
 

</xml_diff>